<commit_message>
Sprint 6: Implemented cert download
</commit_message>
<xml_diff>
--- a/backend/templates/entrada_taller.docx
+++ b/backend/templates/entrada_taller.docx
@@ -72,7 +72,7 @@
           <wp:anchor allowOverlap="1" behindDoc="0" distB="0" distT="0" distL="114300" distR="114300" hidden="0" layoutInCell="1" locked="0" relativeHeight="0" simplePos="0">
             <wp:simplePos x="0" y="0"/>
             <wp:positionH relativeFrom="column">
-              <wp:posOffset>1775160</wp:posOffset>
+              <wp:posOffset>1775159</wp:posOffset>
             </wp:positionH>
             <wp:positionV relativeFrom="paragraph">
               <wp:posOffset>55880</wp:posOffset>
@@ -80,12 +80,12 @@
             <wp:extent cx="1731010" cy="548005"/>
             <wp:effectExtent b="0" l="0" r="0" t="0"/>
             <wp:wrapSquare wrapText="bothSides" distB="0" distT="0" distL="114300" distR="114300"/>
-            <wp:docPr id="1" name="image2.jpg"/>
+            <wp:docPr id="1" name="image1.jpg"/>
             <a:graphic>
               <a:graphicData uri="http://schemas.openxmlformats.org/drawingml/2006/picture">
                 <pic:pic>
                   <pic:nvPicPr>
-                    <pic:cNvPr id="0" name="image2.jpg"/>
+                    <pic:cNvPr id="0" name="image1.jpg"/>
                     <pic:cNvPicPr preferRelativeResize="0"/>
                   </pic:nvPicPr>
                   <pic:blipFill>
@@ -114,7 +114,7 @@
           <wp:anchor allowOverlap="1" behindDoc="0" distB="0" distT="0" distL="114300" distR="114300" hidden="0" layoutInCell="1" locked="0" relativeHeight="0" simplePos="0">
             <wp:simplePos x="0" y="0"/>
             <wp:positionH relativeFrom="column">
-              <wp:posOffset>-267332</wp:posOffset>
+              <wp:posOffset>-267331</wp:posOffset>
             </wp:positionH>
             <wp:positionV relativeFrom="paragraph">
               <wp:posOffset>58474</wp:posOffset>
@@ -122,12 +122,12 @@
             <wp:extent cx="488409" cy="415047"/>
             <wp:effectExtent b="0" l="0" r="0" t="0"/>
             <wp:wrapSquare wrapText="bothSides" distB="0" distT="0" distL="114300" distR="114300"/>
-            <wp:docPr id="2" name="image1.png"/>
+            <wp:docPr id="2" name="image2.png"/>
             <a:graphic>
               <a:graphicData uri="http://schemas.openxmlformats.org/drawingml/2006/picture">
                 <pic:pic>
                   <pic:nvPicPr>
-                    <pic:cNvPr id="0" name="image1.png"/>
+                    <pic:cNvPr id="0" name="image2.png"/>
                     <pic:cNvPicPr preferRelativeResize="0"/>
                   </pic:nvPicPr>
                   <pic:blipFill>
@@ -427,7 +427,7 @@
           <w:highlight w:val="white"/>
           <w:rtl w:val="0"/>
         </w:rPr>
-        <w:t xml:space="preserve"> {empresa}                                                                                   </w:t>
+        <w:t xml:space="preserve"> {empresa}                                                               </w:t>
       </w:r>
       <w:r>
         <w:rPr>

</xml_diff>

<commit_message>
Hotfix: added whatsapp and phone number to document template
</commit_message>
<xml_diff>
--- a/backend/templates/entrada_taller.docx
+++ b/backend/templates/entrada_taller.docx
@@ -72,20 +72,20 @@
           <wp:anchor allowOverlap="1" behindDoc="0" distB="0" distT="0" distL="114300" distR="114300" hidden="0" layoutInCell="1" locked="0" relativeHeight="0" simplePos="0">
             <wp:simplePos x="0" y="0"/>
             <wp:positionH relativeFrom="column">
-              <wp:posOffset>1775159</wp:posOffset>
+              <wp:posOffset>1781175</wp:posOffset>
             </wp:positionH>
             <wp:positionV relativeFrom="paragraph">
-              <wp:posOffset>55880</wp:posOffset>
+              <wp:posOffset>57150</wp:posOffset>
             </wp:positionV>
             <wp:extent cx="1731010" cy="548005"/>
             <wp:effectExtent b="0" l="0" r="0" t="0"/>
             <wp:wrapSquare wrapText="bothSides" distB="0" distT="0" distL="114300" distR="114300"/>
-            <wp:docPr id="1" name="image1.jpg"/>
+            <wp:docPr id="1" name="image2.jpg"/>
             <a:graphic>
               <a:graphicData uri="http://schemas.openxmlformats.org/drawingml/2006/picture">
                 <pic:pic>
                   <pic:nvPicPr>
-                    <pic:cNvPr id="0" name="image1.jpg"/>
+                    <pic:cNvPr id="0" name="image2.jpg"/>
                     <pic:cNvPicPr preferRelativeResize="0"/>
                   </pic:nvPicPr>
                   <pic:blipFill>
@@ -114,7 +114,7 @@
           <wp:anchor allowOverlap="1" behindDoc="0" distB="0" distT="0" distL="114300" distR="114300" hidden="0" layoutInCell="1" locked="0" relativeHeight="0" simplePos="0">
             <wp:simplePos x="0" y="0"/>
             <wp:positionH relativeFrom="column">
-              <wp:posOffset>-267331</wp:posOffset>
+              <wp:posOffset>-267330</wp:posOffset>
             </wp:positionH>
             <wp:positionV relativeFrom="paragraph">
               <wp:posOffset>58474</wp:posOffset>
@@ -122,12 +122,12 @@
             <wp:extent cx="488409" cy="415047"/>
             <wp:effectExtent b="0" l="0" r="0" t="0"/>
             <wp:wrapSquare wrapText="bothSides" distB="0" distT="0" distL="114300" distR="114300"/>
-            <wp:docPr id="2" name="image2.png"/>
+            <wp:docPr id="2" name="image1.png"/>
             <a:graphic>
               <a:graphicData uri="http://schemas.openxmlformats.org/drawingml/2006/picture">
                 <pic:pic>
                   <pic:nvPicPr>
-                    <pic:cNvPr id="0" name="image2.png"/>
+                    <pic:cNvPr id="0" name="image1.png"/>
                     <pic:cNvPicPr preferRelativeResize="0"/>
                   </pic:nvPicPr>
                   <pic:blipFill>
@@ -178,6 +178,25 @@
         <w:tab/>
         <w:tab/>
         <w:tab/>
+      </w:r>
+      <w:r>
+        <w:rPr>
+          <w:rFonts w:ascii="Times New Roman" w:cs="Times New Roman" w:eastAsia="Times New Roman" w:hAnsi="Times New Roman"/>
+          <w:sz w:val="16"/>
+          <w:szCs w:val="16"/>
+          <w:rtl w:val="0"/>
+        </w:rPr>
+        <w:t xml:space="preserve">Whatsapp</w:t>
+      </w:r>
+      <w:r>
+        <w:rPr>
+          <w:rFonts w:ascii="Times New Roman" w:cs="Times New Roman" w:eastAsia="Times New Roman" w:hAnsi="Times New Roman"/>
+          <w:b w:val="1"/>
+          <w:bCs w:val="1"/>
+          <w:sz w:val="16"/>
+          <w:szCs w:val="16"/>
+          <w:rtl w:val="0"/>
+        </w:rPr>
         <w:tab/>
         <w:t xml:space="preserve">      </w:t>
       </w:r>
@@ -189,6 +208,64 @@
           <w:rtl w:val="0"/>
         </w:rPr>
         <w:t xml:space="preserve">809-687-8016</w:t>
+      </w:r>
+    </w:p>
+    <w:p>
+      <w:pPr>
+        <w:ind w:left="-426" w:firstLine="0"/>
+        <w:jc w:val="both"/>
+        <w:rPr>
+          <w:rFonts w:ascii="Times New Roman" w:cs="Times New Roman" w:eastAsia="Times New Roman" w:hAnsi="Times New Roman"/>
+          <w:sz w:val="16"/>
+          <w:szCs w:val="16"/>
+        </w:rPr>
+      </w:pPr>
+      <w:r>
+        <w:rPr>
+          <w:rFonts w:ascii="Times New Roman" w:cs="Times New Roman" w:eastAsia="Times New Roman" w:hAnsi="Times New Roman"/>
+          <w:b w:val="1"/>
+          <w:bCs w:val="1"/>
+          <w:sz w:val="16"/>
+          <w:szCs w:val="16"/>
+          <w:rtl w:val="0"/>
+        </w:rPr>
+        <w:tab/>
+        <w:tab/>
+        <w:tab/>
+        <w:tab/>
+        <w:tab/>
+        <w:tab/>
+        <w:tab/>
+      </w:r>
+      <w:r>
+        <w:rPr>
+          <w:rFonts w:ascii="Times New Roman" w:cs="Times New Roman" w:eastAsia="Times New Roman" w:hAnsi="Times New Roman"/>
+          <w:sz w:val="16"/>
+          <w:szCs w:val="16"/>
+          <w:rtl w:val="0"/>
+        </w:rPr>
+        <w:t xml:space="preserve">Tel.</w:t>
+      </w:r>
+      <w:r>
+        <w:rPr>
+          <w:rFonts w:ascii="Times New Roman" w:cs="Times New Roman" w:eastAsia="Times New Roman" w:hAnsi="Times New Roman"/>
+          <w:b w:val="1"/>
+          <w:bCs w:val="1"/>
+          <w:sz w:val="16"/>
+          <w:szCs w:val="16"/>
+          <w:rtl w:val="0"/>
+        </w:rPr>
+        <w:tab/>
+        <w:t xml:space="preserve">      </w:t>
+      </w:r>
+      <w:r>
+        <w:rPr>
+          <w:rFonts w:ascii="Times New Roman" w:cs="Times New Roman" w:eastAsia="Times New Roman" w:hAnsi="Times New Roman"/>
+          <w:sz w:val="16"/>
+          <w:szCs w:val="16"/>
+          <w:rtl w:val="0"/>
+        </w:rPr>
+        <w:t xml:space="preserve">829-687-8016</w:t>
       </w:r>
     </w:p>
     <w:p>

</xml_diff>

<commit_message>
Sprint 9: Diagnostic is now on document template
</commit_message>
<xml_diff>
--- a/backend/templates/entrada_taller.docx
+++ b/backend/templates/entrada_taller.docx
@@ -930,7 +930,21 @@
           <w:szCs w:val="20"/>
           <w:rtl w:val="0"/>
         </w:rPr>
-        <w:t xml:space="preserve">                                                                                             </w:t>
+        <w:t xml:space="preserve">                                                                                                                  </w:t>
+      </w:r>
+      <w:r>
+        <w:rPr>
+          <w:rFonts w:ascii="Times New Roman" w:cs="Times New Roman" w:eastAsia="Times New Roman" w:hAnsi="Times New Roman"/>
+          <w:sz w:val="20"/>
+          <w:szCs w:val="20"/>
+          <w:rtl w:val="0"/>
+        </w:rPr>
+        <w:t xml:space="preserve">{diagnostico}</w:t>
+      </w:r>
+      <w:r>
+        <w:rPr>
+          <w:rtl w:val="0"/>
+        </w:rPr>
       </w:r>
     </w:p>
     <w:p>

</xml_diff>